<commit_message>
Some script adjustments & data restoring
</commit_message>
<xml_diff>
--- a/Sprint Review/CW29/Editor In-App Questionnaire.docx
+++ b/Sprint Review/CW29/Editor In-App Questionnaire.docx
@@ -1,14 +1,14 @@
 
 <file path=word/document.xml><?xml version="1.0" encoding="utf-8"?>
-<w:document xmlns:wpc="http://schemas.microsoft.com/office/word/2010/wordprocessingCanvas" xmlns:cx="http://schemas.microsoft.com/office/drawing/2014/chartex" xmlns:cx1="http://schemas.microsoft.com/office/drawing/2015/9/8/chartex" xmlns:cx2="http://schemas.microsoft.com/office/drawing/2015/10/21/chartex" xmlns:cx3="http://schemas.microsoft.com/office/drawing/2016/5/9/chartex" xmlns:cx4="http://schemas.microsoft.com/office/drawing/2016/5/10/chartex" xmlns:cx5="http://schemas.microsoft.com/office/drawing/2016/5/11/chartex" xmlns:cx6="http://schemas.microsoft.com/office/drawing/2016/5/12/chartex" xmlns:cx7="http://schemas.microsoft.com/office/drawing/2016/5/13/chartex" xmlns:cx8="http://schemas.microsoft.com/office/drawing/2016/5/14/chartex" xmlns:mc="http://schemas.openxmlformats.org/markup-compatibility/2006" xmlns:aink="http://schemas.microsoft.com/office/drawing/2016/ink" xmlns:am3d="http://schemas.microsoft.com/office/drawing/2017/model3d" xmlns:o="urn:schemas-microsoft-com:office:office" xmlns:oel="http://schemas.microsoft.com/office/2019/extlst" xmlns:r="http://schemas.openxmlformats.org/officeDocument/2006/relationships" xmlns:m="http://schemas.openxmlformats.org/officeDocument/2006/math" xmlns:v="urn:schemas-microsoft-com:vml" xmlns:wp14="http://schemas.microsoft.com/office/word/2010/wordprocessingDrawing" xmlns:wp="http://schemas.openxmlformats.org/drawingml/2006/wordprocessingDrawing" xmlns:w10="urn:schemas-microsoft-com:office:word" xmlns:w="http://schemas.openxmlformats.org/wordprocessingml/2006/main" xmlns:w14="http://schemas.microsoft.com/office/word/2010/wordml" xmlns:w15="http://schemas.microsoft.com/office/word/2012/wordml" xmlns:w16cex="http://schemas.microsoft.com/office/word/2018/wordml/cex" xmlns:w16cid="http://schemas.microsoft.com/office/word/2016/wordml/cid" xmlns:w16="http://schemas.microsoft.com/office/word/2018/wordml" xmlns:w16du="http://schemas.microsoft.com/office/word/2023/wordml/word16du" xmlns:w16sdtdh="http://schemas.microsoft.com/office/word/2020/wordml/sdtdatahash" xmlns:w16sdtfl="http://schemas.microsoft.com/office/word/2024/wordml/sdtformatlock" xmlns:w16se="http://schemas.microsoft.com/office/word/2015/wordml/symex" xmlns:wpg="http://schemas.microsoft.com/office/word/2010/wordprocessingGroup" xmlns:wpi="http://schemas.microsoft.com/office/word/2010/wordprocessingInk" xmlns:wne="http://schemas.microsoft.com/office/word/2006/wordml" xmlns:wps="http://schemas.microsoft.com/office/word/2010/wordprocessingShape" mc:Ignorable="w14 w15 w16se w16cid w16 w16cex w16sdtdh w16sdtfl w16du wp14">
+<w:document xmlns:wpc="http://schemas.microsoft.com/office/word/2010/wordprocessingCanvas" xmlns:cx="http://schemas.microsoft.com/office/drawing/2014/chartex" xmlns:cx1="http://schemas.microsoft.com/office/drawing/2015/9/8/chartex" xmlns:cx2="http://schemas.microsoft.com/office/drawing/2015/10/21/chartex" xmlns:cx3="http://schemas.microsoft.com/office/drawing/2016/5/9/chartex" xmlns:cx4="http://schemas.microsoft.com/office/drawing/2016/5/10/chartex" xmlns:cx5="http://schemas.microsoft.com/office/drawing/2016/5/11/chartex" xmlns:cx6="http://schemas.microsoft.com/office/drawing/2016/5/12/chartex" xmlns:cx7="http://schemas.microsoft.com/office/drawing/2016/5/13/chartex" xmlns:cx8="http://schemas.microsoft.com/office/drawing/2016/5/14/chartex" xmlns:mc="http://schemas.openxmlformats.org/markup-compatibility/2006" xmlns:aink="http://schemas.microsoft.com/office/drawing/2016/ink" xmlns:am3d="http://schemas.microsoft.com/office/drawing/2017/model3d" xmlns:o="urn:schemas-microsoft-com:office:office" xmlns:oel="http://schemas.microsoft.com/office/2019/extlst" xmlns:r="http://schemas.openxmlformats.org/officeDocument/2006/relationships" xmlns:m="http://schemas.openxmlformats.org/officeDocument/2006/math" xmlns:v="urn:schemas-microsoft-com:vml" xmlns:wp14="http://schemas.microsoft.com/office/word/2010/wordprocessingDrawing" xmlns:wp="http://schemas.openxmlformats.org/drawingml/2006/wordprocessingDrawing" xmlns:w10="urn:schemas-microsoft-com:office:word" xmlns:w="http://schemas.openxmlformats.org/wordprocessingml/2006/main" xmlns:w14="http://schemas.microsoft.com/office/word/2010/wordml" xmlns:w15="http://schemas.microsoft.com/office/word/2012/wordml" xmlns:w16cex="http://schemas.microsoft.com/office/word/2018/wordml/cex" xmlns:w16cid="http://schemas.microsoft.com/office/word/2016/wordml/cid" xmlns:w16="http://schemas.microsoft.com/office/word/2018/wordml" xmlns:w16du="http://schemas.microsoft.com/office/word/2023/wordml/word16du" xmlns:w16sdtdh="http://schemas.microsoft.com/office/word/2020/wordml/sdtdatahash" xmlns:w16sdtfl="http://schemas.microsoft.com/office/word/2024/wordml/sdtformatlock" xmlns:w16se="http://schemas.microsoft.com/office/word/2015/wordml/symex" xmlns:wpg="http://schemas.microsoft.com/office/word/2010/wordprocessingGroup" xmlns:wpi="http://schemas.microsoft.com/office/word/2010/wordprocessingInk" xmlns:wne="http://schemas.microsoft.com/office/word/2006/wordml" xmlns:wps="http://schemas.microsoft.com/office/word/2010/wordprocessingShape" xmlns:a="http://schemas.openxmlformats.org/drawingml/2006/main" xmlns:pic="http://schemas.openxmlformats.org/drawingml/2006/picture" mc:Ignorable="w14 w15 w16se w16cid w16 w16cex w16sdtdh w16sdtfl w16du wp14">
   <w:background w:color="EFEEEA"/>
   <w:body>
     <w:tbl>
       <w:tblPr>
         <w:tblW w:w="15704" w:type="dxa"/>
         <w:tblBorders>
-          <w:insideH w:val="single" w:sz="4" w:space="0" w:color="auto"/>
-          <w:insideV w:val="single" w:sz="4" w:space="0" w:color="auto"/>
+          <w:insideH w:val="single" w:color="auto" w:sz="4" w:space="0"/>
+          <w:insideV w:val="single" w:color="auto" w:sz="4" w:space="0"/>
         </w:tblBorders>
         <w:tblCellMar>
           <w:left w:w="10" w:type="dxa"/>
@@ -111,7 +111,7 @@
       </w:pPr>
       <w:r>
         <w:rPr>
-          <w:rFonts w:ascii="DM Sans Light" w:eastAsia="DM Sans Light" w:hAnsi="DM Sans Light" w:cs="DM Sans Light"/>
+          <w:rFonts w:ascii="DM Sans Light" w:hAnsi="DM Sans Light" w:eastAsia="DM Sans Light" w:cs="DM Sans Light"/>
           <w:sz w:val="52"/>
           <w:szCs w:val="52"/>
         </w:rPr>
@@ -134,7 +134,7 @@
     <w:p>
       <w:pPr>
         <w:pBdr>
-          <w:bottom w:val="dotted" w:sz="4" w:space="1" w:color="C2BCC2"/>
+          <w:bottom w:val="dotted" w:color="C2BCC2" w:sz="4" w:space="1"/>
         </w:pBdr>
         <w:spacing w:before="60" w:after="60"/>
       </w:pPr>
@@ -143,8 +143,8 @@
       <w:tblPr>
         <w:tblW w:w="15704" w:type="dxa"/>
         <w:tblBorders>
-          <w:insideH w:val="single" w:sz="4" w:space="0" w:color="auto"/>
-          <w:insideV w:val="single" w:sz="4" w:space="0" w:color="auto"/>
+          <w:insideH w:val="single" w:color="auto" w:sz="4" w:space="0"/>
+          <w:insideV w:val="single" w:color="auto" w:sz="4" w:space="0"/>
         </w:tblBorders>
         <w:tblCellMar>
           <w:left w:w="10" w:type="dxa"/>
@@ -172,7 +172,7 @@
           <w:tcPr>
             <w:tcW w:w="2243" w:type="dxa"/>
             <w:tcBorders>
-              <w:right w:val="dotted" w:sz="4" w:space="6" w:color="C2BCC2"/>
+              <w:right w:val="dotted" w:color="C2BCC2" w:sz="4" w:space="6"/>
             </w:tcBorders>
             <w:tcMar>
               <w:top w:w="60" w:type="dxa"/>
@@ -187,7 +187,7 @@
             </w:pPr>
             <w:r>
               <w:rPr>
-                <w:rFonts w:ascii="DM Sans Light" w:eastAsia="DM Sans Light" w:hAnsi="DM Sans Light" w:cs="DM Sans Light"/>
+                <w:rFonts w:ascii="DM Sans Light" w:hAnsi="DM Sans Light" w:eastAsia="DM Sans Light" w:cs="DM Sans Light"/>
                 <w:color w:val="613E6E"/>
                 <w:sz w:val="44"/>
                 <w:szCs w:val="44"/>
@@ -210,7 +210,7 @@
           <w:tcPr>
             <w:tcW w:w="2243" w:type="dxa"/>
             <w:tcBorders>
-              <w:right w:val="dotted" w:sz="4" w:space="6" w:color="C2BCC2"/>
+              <w:right w:val="dotted" w:color="C2BCC2" w:sz="4" w:space="6"/>
             </w:tcBorders>
             <w:tcMar>
               <w:top w:w="60" w:type="dxa"/>
@@ -225,7 +225,7 @@
             </w:pPr>
             <w:r>
               <w:rPr>
-                <w:rFonts w:ascii="DM Sans Light" w:eastAsia="DM Sans Light" w:hAnsi="DM Sans Light" w:cs="DM Sans Light"/>
+                <w:rFonts w:ascii="DM Sans Light" w:hAnsi="DM Sans Light" w:eastAsia="DM Sans Light" w:cs="DM Sans Light"/>
                 <w:color w:val="613E6E"/>
                 <w:sz w:val="44"/>
                 <w:szCs w:val="44"/>
@@ -248,7 +248,7 @@
           <w:tcPr>
             <w:tcW w:w="2243" w:type="dxa"/>
             <w:tcBorders>
-              <w:right w:val="dotted" w:sz="4" w:space="6" w:color="C2BCC2"/>
+              <w:right w:val="dotted" w:color="C2BCC2" w:sz="4" w:space="6"/>
             </w:tcBorders>
             <w:tcMar>
               <w:top w:w="60" w:type="dxa"/>
@@ -263,7 +263,7 @@
             </w:pPr>
             <w:r>
               <w:rPr>
-                <w:rFonts w:ascii="DM Sans Light" w:eastAsia="DM Sans Light" w:hAnsi="DM Sans Light" w:cs="DM Sans Light"/>
+                <w:rFonts w:ascii="DM Sans Light" w:hAnsi="DM Sans Light" w:eastAsia="DM Sans Light" w:cs="DM Sans Light"/>
                 <w:color w:val="613E6E"/>
                 <w:sz w:val="44"/>
                 <w:szCs w:val="44"/>
@@ -286,7 +286,7 @@
           <w:tcPr>
             <w:tcW w:w="2243" w:type="dxa"/>
             <w:tcBorders>
-              <w:right w:val="dotted" w:sz="4" w:space="6" w:color="C2BCC2"/>
+              <w:right w:val="dotted" w:color="C2BCC2" w:sz="4" w:space="6"/>
             </w:tcBorders>
             <w:tcMar>
               <w:top w:w="60" w:type="dxa"/>
@@ -301,7 +301,7 @@
             </w:pPr>
             <w:r>
               <w:rPr>
-                <w:rFonts w:ascii="DM Sans Light" w:eastAsia="DM Sans Light" w:hAnsi="DM Sans Light" w:cs="DM Sans Light"/>
+                <w:rFonts w:ascii="DM Sans Light" w:hAnsi="DM Sans Light" w:eastAsia="DM Sans Light" w:cs="DM Sans Light"/>
                 <w:color w:val="613E6E"/>
                 <w:sz w:val="44"/>
                 <w:szCs w:val="44"/>
@@ -324,7 +324,7 @@
           <w:tcPr>
             <w:tcW w:w="2243" w:type="dxa"/>
             <w:tcBorders>
-              <w:right w:val="dotted" w:sz="4" w:space="6" w:color="C2BCC2"/>
+              <w:right w:val="dotted" w:color="C2BCC2" w:sz="4" w:space="6"/>
             </w:tcBorders>
             <w:tcMar>
               <w:top w:w="60" w:type="dxa"/>
@@ -339,7 +339,7 @@
             </w:pPr>
             <w:r>
               <w:rPr>
-                <w:rFonts w:ascii="DM Sans Light" w:eastAsia="DM Sans Light" w:hAnsi="DM Sans Light" w:cs="DM Sans Light"/>
+                <w:rFonts w:ascii="DM Sans Light" w:hAnsi="DM Sans Light" w:eastAsia="DM Sans Light" w:cs="DM Sans Light"/>
                 <w:color w:val="613E6E"/>
                 <w:sz w:val="44"/>
                 <w:szCs w:val="44"/>
@@ -362,7 +362,7 @@
           <w:tcPr>
             <w:tcW w:w="2243" w:type="dxa"/>
             <w:tcBorders>
-              <w:right w:val="dotted" w:sz="4" w:space="6" w:color="C2BCC2"/>
+              <w:right w:val="dotted" w:color="C2BCC2" w:sz="4" w:space="6"/>
             </w:tcBorders>
             <w:tcMar>
               <w:top w:w="60" w:type="dxa"/>
@@ -377,7 +377,7 @@
             </w:pPr>
             <w:r>
               <w:rPr>
-                <w:rFonts w:ascii="DM Sans Light" w:eastAsia="DM Sans Light" w:hAnsi="DM Sans Light" w:cs="DM Sans Light"/>
+                <w:rFonts w:ascii="DM Sans Light" w:hAnsi="DM Sans Light" w:eastAsia="DM Sans Light" w:cs="DM Sans Light"/>
                 <w:color w:val="613E6E"/>
                 <w:sz w:val="44"/>
                 <w:szCs w:val="44"/>
@@ -412,7 +412,7 @@
             </w:pPr>
             <w:r>
               <w:rPr>
-                <w:rFonts w:ascii="DM Sans Light" w:eastAsia="DM Sans Light" w:hAnsi="DM Sans Light" w:cs="DM Sans Light"/>
+                <w:rFonts w:ascii="DM Sans Light" w:hAnsi="DM Sans Light" w:eastAsia="DM Sans Light" w:cs="DM Sans Light"/>
                 <w:color w:val="613E6E"/>
                 <w:sz w:val="44"/>
                 <w:szCs w:val="44"/>
@@ -438,11 +438,6 @@
         <w:spacing w:before="20" w:after="20"/>
       </w:pPr>
       <w:r>
-        <w:rPr>
-          <w:color w:val="796F7A"/>
-          <w:sz w:val="18"/>
-          <w:szCs w:val="18"/>
-        </w:rPr>
         <w:br/>
       </w:r>
       <w:r>
@@ -450,15 +445,17 @@
           <w:color w:val="796F7A"/>
           <w:sz w:val="18"/>
           <w:szCs w:val="18"/>
+          <w:lang w:val="en-US"/>
         </w:rPr>
         <w:t xml:space="preserve">Database now </w:t>
       </w:r>
       <w:r>
         <w:rPr>
-          <w:b/>
-          <w:bCs/>
+          <w:b w:val="1"/>
+          <w:bCs w:val="1"/>
           <w:sz w:val="18"/>
           <w:szCs w:val="18"/>
+          <w:lang w:val="en-US"/>
         </w:rPr>
         <w:t>377 records</w:t>
       </w:r>
@@ -467,15 +464,17 @@
           <w:color w:val="796F7A"/>
           <w:sz w:val="18"/>
           <w:szCs w:val="18"/>
+          <w:lang w:val="en-US"/>
         </w:rPr>
         <w:t xml:space="preserve"> · 7 created in this study, </w:t>
       </w:r>
       <w:r>
         <w:rPr>
-          <w:b/>
-          <w:bCs/>
+          <w:b w:val="1"/>
+          <w:bCs w:val="1"/>
           <w:sz w:val="18"/>
           <w:szCs w:val="18"/>
+          <w:lang w:val="en-US"/>
         </w:rPr>
         <w:t>#486 consolidated → ID 140 (14)</w:t>
       </w:r>
@@ -484,6 +483,7 @@
           <w:color w:val="796F7A"/>
           <w:sz w:val="18"/>
           <w:szCs w:val="18"/>
+          <w:lang w:val="en-US"/>
         </w:rPr>
         <w:t xml:space="preserve">        4 bugs logged to bug list (8 → 12)        11 rejected = 10 bugs + 1 feature (DMS drag-in)        #15 also spawned new record #488 (save own prompts)</w:t>
       </w:r>
@@ -764,11 +764,11 @@
 </file>
 
 <file path=word/styles.xml><?xml version="1.0" encoding="utf-8"?>
-<w:styles xmlns:mc="http://schemas.openxmlformats.org/markup-compatibility/2006" xmlns:r="http://schemas.openxmlformats.org/officeDocument/2006/relationships" xmlns:w="http://schemas.openxmlformats.org/wordprocessingml/2006/main" xmlns:w14="http://schemas.microsoft.com/office/word/2010/wordml" xmlns:w15="http://schemas.microsoft.com/office/word/2012/wordml" xmlns:w16cex="http://schemas.microsoft.com/office/word/2018/wordml/cex" xmlns:w16cid="http://schemas.microsoft.com/office/word/2016/wordml/cid" xmlns:w16="http://schemas.microsoft.com/office/word/2018/wordml" xmlns:w16du="http://schemas.microsoft.com/office/word/2023/wordml/word16du" xmlns:w16sdtdh="http://schemas.microsoft.com/office/word/2020/wordml/sdtdatahash" xmlns:w16sdtfl="http://schemas.microsoft.com/office/word/2024/wordml/sdtformatlock" xmlns:w16se="http://schemas.microsoft.com/office/word/2015/wordml/symex" mc:Ignorable="w14 w15 w16se w16cid w16 w16cex w16sdtdh w16sdtfl w16du">
+<w:styles xmlns:wp14="http://schemas.microsoft.com/office/word/2010/wordprocessingDrawing" xmlns:mc="http://schemas.openxmlformats.org/markup-compatibility/2006" xmlns:r="http://schemas.openxmlformats.org/officeDocument/2006/relationships" xmlns:w="http://schemas.openxmlformats.org/wordprocessingml/2006/main" xmlns:w14="http://schemas.microsoft.com/office/word/2010/wordml" xmlns:w15="http://schemas.microsoft.com/office/word/2012/wordml" xmlns:w16cex="http://schemas.microsoft.com/office/word/2018/wordml/cex" xmlns:w16cid="http://schemas.microsoft.com/office/word/2016/wordml/cid" xmlns:w16="http://schemas.microsoft.com/office/word/2018/wordml" xmlns:w16du="http://schemas.microsoft.com/office/word/2023/wordml/word16du" xmlns:w16sdtdh="http://schemas.microsoft.com/office/word/2020/wordml/sdtdatahash" xmlns:w16sdtfl="http://schemas.microsoft.com/office/word/2024/wordml/sdtformatlock" xmlns:w16se="http://schemas.microsoft.com/office/word/2015/wordml/symex" mc:Ignorable="w14 w15 w16se w16cid w16 w16cex w16sdtdh w16sdtfl w16du wp14">
   <w:docDefaults>
     <w:rPrDefault>
       <w:rPr>
-        <w:rFonts w:ascii="DM Sans" w:eastAsia="DM Sans" w:hAnsi="DM Sans" w:cs="DM Sans"/>
+        <w:rFonts w:ascii="DM Sans" w:hAnsi="DM Sans" w:eastAsia="DM Sans" w:cs="DM Sans"/>
         <w:color w:val="200F21"/>
         <w:lang w:val="en-DE" w:eastAsia="en-GB" w:bidi="ar-SA"/>
       </w:rPr>
@@ -778,14 +778,14 @@
   <w:latentStyles w:defLockedState="0" w:defUIPriority="99" w:defSemiHidden="0" w:defUnhideWhenUsed="0" w:defQFormat="0" w:count="376">
     <w:lsdException w:name="Normal" w:uiPriority="0" w:qFormat="1"/>
     <w:lsdException w:name="heading 1" w:uiPriority="9" w:qFormat="1"/>
-    <w:lsdException w:name="heading 2" w:semiHidden="1" w:uiPriority="9" w:unhideWhenUsed="1" w:qFormat="1"/>
-    <w:lsdException w:name="heading 3" w:semiHidden="1" w:uiPriority="9" w:unhideWhenUsed="1" w:qFormat="1"/>
-    <w:lsdException w:name="heading 4" w:semiHidden="1" w:uiPriority="9" w:unhideWhenUsed="1" w:qFormat="1"/>
-    <w:lsdException w:name="heading 5" w:semiHidden="1" w:uiPriority="9" w:unhideWhenUsed="1" w:qFormat="1"/>
-    <w:lsdException w:name="heading 6" w:semiHidden="1" w:uiPriority="9" w:unhideWhenUsed="1" w:qFormat="1"/>
-    <w:lsdException w:name="heading 7" w:semiHidden="1" w:uiPriority="9" w:unhideWhenUsed="1" w:qFormat="1"/>
-    <w:lsdException w:name="heading 8" w:semiHidden="1" w:uiPriority="9" w:unhideWhenUsed="1" w:qFormat="1"/>
-    <w:lsdException w:name="heading 9" w:semiHidden="1" w:uiPriority="9" w:unhideWhenUsed="1" w:qFormat="1"/>
+    <w:lsdException w:name="heading 2" w:uiPriority="9" w:semiHidden="1" w:unhideWhenUsed="1" w:qFormat="1"/>
+    <w:lsdException w:name="heading 3" w:uiPriority="9" w:semiHidden="1" w:unhideWhenUsed="1" w:qFormat="1"/>
+    <w:lsdException w:name="heading 4" w:uiPriority="9" w:semiHidden="1" w:unhideWhenUsed="1" w:qFormat="1"/>
+    <w:lsdException w:name="heading 5" w:uiPriority="9" w:semiHidden="1" w:unhideWhenUsed="1" w:qFormat="1"/>
+    <w:lsdException w:name="heading 6" w:uiPriority="9" w:semiHidden="1" w:unhideWhenUsed="1" w:qFormat="1"/>
+    <w:lsdException w:name="heading 7" w:uiPriority="9" w:semiHidden="1" w:unhideWhenUsed="1" w:qFormat="1"/>
+    <w:lsdException w:name="heading 8" w:uiPriority="9" w:semiHidden="1" w:unhideWhenUsed="1" w:qFormat="1"/>
+    <w:lsdException w:name="heading 9" w:uiPriority="9" w:semiHidden="1" w:unhideWhenUsed="1" w:qFormat="1"/>
     <w:lsdException w:name="index 1" w:semiHidden="1" w:unhideWhenUsed="1"/>
     <w:lsdException w:name="index 2" w:semiHidden="1" w:unhideWhenUsed="1"/>
     <w:lsdException w:name="index 3" w:semiHidden="1" w:unhideWhenUsed="1"/>
@@ -795,22 +795,22 @@
     <w:lsdException w:name="index 7" w:semiHidden="1" w:unhideWhenUsed="1"/>
     <w:lsdException w:name="index 8" w:semiHidden="1" w:unhideWhenUsed="1"/>
     <w:lsdException w:name="index 9" w:semiHidden="1" w:unhideWhenUsed="1"/>
-    <w:lsdException w:name="toc 1" w:semiHidden="1" w:uiPriority="39" w:unhideWhenUsed="1"/>
-    <w:lsdException w:name="toc 2" w:semiHidden="1" w:uiPriority="39" w:unhideWhenUsed="1"/>
-    <w:lsdException w:name="toc 3" w:semiHidden="1" w:uiPriority="39" w:unhideWhenUsed="1"/>
-    <w:lsdException w:name="toc 4" w:semiHidden="1" w:uiPriority="39" w:unhideWhenUsed="1"/>
-    <w:lsdException w:name="toc 5" w:semiHidden="1" w:uiPriority="39" w:unhideWhenUsed="1"/>
-    <w:lsdException w:name="toc 6" w:semiHidden="1" w:uiPriority="39" w:unhideWhenUsed="1"/>
-    <w:lsdException w:name="toc 7" w:semiHidden="1" w:uiPriority="39" w:unhideWhenUsed="1"/>
-    <w:lsdException w:name="toc 8" w:semiHidden="1" w:uiPriority="39" w:unhideWhenUsed="1"/>
-    <w:lsdException w:name="toc 9" w:semiHidden="1" w:uiPriority="39" w:unhideWhenUsed="1"/>
+    <w:lsdException w:name="toc 1" w:uiPriority="39" w:semiHidden="1" w:unhideWhenUsed="1"/>
+    <w:lsdException w:name="toc 2" w:uiPriority="39" w:semiHidden="1" w:unhideWhenUsed="1"/>
+    <w:lsdException w:name="toc 3" w:uiPriority="39" w:semiHidden="1" w:unhideWhenUsed="1"/>
+    <w:lsdException w:name="toc 4" w:uiPriority="39" w:semiHidden="1" w:unhideWhenUsed="1"/>
+    <w:lsdException w:name="toc 5" w:uiPriority="39" w:semiHidden="1" w:unhideWhenUsed="1"/>
+    <w:lsdException w:name="toc 6" w:uiPriority="39" w:semiHidden="1" w:unhideWhenUsed="1"/>
+    <w:lsdException w:name="toc 7" w:uiPriority="39" w:semiHidden="1" w:unhideWhenUsed="1"/>
+    <w:lsdException w:name="toc 8" w:uiPriority="39" w:semiHidden="1" w:unhideWhenUsed="1"/>
+    <w:lsdException w:name="toc 9" w:uiPriority="39" w:semiHidden="1" w:unhideWhenUsed="1"/>
     <w:lsdException w:name="Normal Indent" w:semiHidden="1" w:unhideWhenUsed="1"/>
     <w:lsdException w:name="footnote text" w:semiHidden="1" w:unhideWhenUsed="1"/>
     <w:lsdException w:name="annotation text" w:semiHidden="1" w:unhideWhenUsed="1"/>
     <w:lsdException w:name="header" w:semiHidden="1" w:unhideWhenUsed="1"/>
     <w:lsdException w:name="footer" w:semiHidden="1" w:unhideWhenUsed="1"/>
     <w:lsdException w:name="index heading" w:semiHidden="1" w:unhideWhenUsed="1"/>
-    <w:lsdException w:name="caption" w:semiHidden="1" w:uiPriority="35" w:unhideWhenUsed="1" w:qFormat="1"/>
+    <w:lsdException w:name="caption" w:uiPriority="35" w:semiHidden="1" w:unhideWhenUsed="1" w:qFormat="1"/>
     <w:lsdException w:name="table of figures" w:semiHidden="1" w:unhideWhenUsed="1"/>
     <w:lsdException w:name="envelope address" w:semiHidden="1" w:unhideWhenUsed="1"/>
     <w:lsdException w:name="envelope return" w:semiHidden="1" w:unhideWhenUsed="1"/>
@@ -841,7 +841,7 @@
     <w:lsdException w:name="Title" w:uiPriority="10" w:qFormat="1"/>
     <w:lsdException w:name="Closing" w:semiHidden="1" w:unhideWhenUsed="1"/>
     <w:lsdException w:name="Signature" w:semiHidden="1" w:unhideWhenUsed="1"/>
-    <w:lsdException w:name="Default Paragraph Font" w:semiHidden="1" w:uiPriority="1" w:unhideWhenUsed="1"/>
+    <w:lsdException w:name="Default Paragraph Font" w:uiPriority="1" w:semiHidden="1" w:unhideWhenUsed="1"/>
     <w:lsdException w:name="Body Text" w:semiHidden="1" w:unhideWhenUsed="1"/>
     <w:lsdException w:name="Body Text Indent" w:semiHidden="1" w:unhideWhenUsed="1"/>
     <w:lsdException w:name="List Continue" w:semiHidden="1" w:unhideWhenUsed="1"/>
@@ -1041,8 +1041,8 @@
     <w:lsdException w:name="Subtle Reference" w:uiPriority="31" w:qFormat="1"/>
     <w:lsdException w:name="Intense Reference" w:uiPriority="32" w:qFormat="1"/>
     <w:lsdException w:name="Book Title" w:uiPriority="33" w:qFormat="1"/>
-    <w:lsdException w:name="Bibliography" w:semiHidden="1" w:uiPriority="37" w:unhideWhenUsed="1"/>
-    <w:lsdException w:name="TOC Heading" w:semiHidden="1" w:uiPriority="39" w:unhideWhenUsed="1" w:qFormat="1"/>
+    <w:lsdException w:name="Bibliography" w:uiPriority="37" w:semiHidden="1" w:unhideWhenUsed="1"/>
+    <w:lsdException w:name="TOC Heading" w:uiPriority="39" w:semiHidden="1" w:unhideWhenUsed="1" w:qFormat="1"/>
     <w:lsdException w:name="Plain Table 1" w:uiPriority="41"/>
     <w:lsdException w:name="Plain Table 2" w:uiPriority="42"/>
     <w:lsdException w:name="Plain Table 3" w:uiPriority="43"/>
@@ -1153,7 +1153,7 @@
     <w:lsdException w:name="Unresolved Mention" w:semiHidden="1" w:unhideWhenUsed="1"/>
     <w:lsdException w:name="Smart Link" w:semiHidden="1" w:unhideWhenUsed="1"/>
   </w:latentStyles>
-  <w:style w:type="paragraph" w:default="1" w:styleId="Normal">
+  <w:style w:type="paragraph" w:styleId="Normal" w:default="1">
     <w:name w:val="Normal"/>
     <w:qFormat/>
   </w:style>
@@ -1241,13 +1241,13 @@
       <w:color w:val="1F4D78"/>
     </w:rPr>
   </w:style>
-  <w:style w:type="character" w:default="1" w:styleId="DefaultParagraphFont">
+  <w:style w:type="character" w:styleId="DefaultParagraphFont" w:default="1">
     <w:name w:val="Default Paragraph Font"/>
     <w:uiPriority w:val="1"/>
     <w:semiHidden/>
     <w:unhideWhenUsed/>
   </w:style>
-  <w:style w:type="table" w:default="1" w:styleId="TableNormal">
+  <w:style w:type="table" w:styleId="TableNormal" w:default="1">
     <w:name w:val="Normal Table"/>
     <w:uiPriority w:val="99"/>
     <w:semiHidden/>
@@ -1262,7 +1262,7 @@
       </w:tblCellMar>
     </w:tblPr>
   </w:style>
-  <w:style w:type="numbering" w:default="1" w:styleId="NoList">
+  <w:style w:type="numbering" w:styleId="NoList" w:default="1">
     <w:name w:val="No List"/>
     <w:uiPriority w:val="99"/>
     <w:semiHidden/>
@@ -1277,7 +1277,7 @@
       <w:szCs w:val="56"/>
     </w:rPr>
   </w:style>
-  <w:style w:type="paragraph" w:customStyle="1" w:styleId="Strong1">
+  <w:style w:type="paragraph" w:styleId="Strong1" w:customStyle="1">
     <w:name w:val="Strong1"/>
     <w:qFormat/>
     <w:rPr>
@@ -1314,7 +1314,7 @@
     <w:semiHidden/>
     <w:unhideWhenUsed/>
   </w:style>
-  <w:style w:type="character" w:customStyle="1" w:styleId="FootnoteTextChar">
+  <w:style w:type="character" w:styleId="FootnoteTextChar" w:customStyle="1">
     <w:name w:val="Footnote Text Char"/>
     <w:link w:val="FootnoteText"/>
     <w:uiPriority w:val="99"/>
@@ -1341,7 +1341,7 @@
     <w:semiHidden/>
     <w:unhideWhenUsed/>
   </w:style>
-  <w:style w:type="character" w:customStyle="1" w:styleId="EndnoteTextChar">
+  <w:style w:type="character" w:styleId="EndnoteTextChar" w:customStyle="1">
     <w:name w:val="Endnote Text Char"/>
     <w:link w:val="EndnoteText"/>
     <w:uiPriority w:val="99"/>
@@ -1366,7 +1366,7 @@
       </w:tabs>
     </w:pPr>
   </w:style>
-  <w:style w:type="character" w:customStyle="1" w:styleId="HeaderChar">
+  <w:style w:type="character" w:styleId="HeaderChar" w:customStyle="1">
     <w:name w:val="Header Char"/>
     <w:basedOn w:val="DefaultParagraphFont"/>
     <w:link w:val="Header"/>
@@ -1387,7 +1387,7 @@
       </w:tabs>
     </w:pPr>
   </w:style>
-  <w:style w:type="character" w:customStyle="1" w:styleId="FooterChar">
+  <w:style w:type="character" w:styleId="FooterChar" w:customStyle="1">
     <w:name w:val="Footer Char"/>
     <w:basedOn w:val="DefaultParagraphFont"/>
     <w:link w:val="Footer"/>
@@ -1398,7 +1398,7 @@
 </file>
 
 <file path=word/theme/theme1.xml><?xml version="1.0" encoding="utf-8"?>
-<a:theme xmlns:a="http://schemas.openxmlformats.org/drawingml/2006/main" name="Office Theme">
+<a:theme xmlns:a="http://schemas.openxmlformats.org/drawingml/2006/main" xmlns:thm15="http://schemas.microsoft.com/office/thememl/2012/main" name="Office Theme">
   <a:themeElements>
     <a:clrScheme name="Office">
       <a:dk1>
@@ -1713,8 +1713,8 @@
 </file>
 
 <file path=customXml/item1.xml><?xml version="1.0" encoding="utf-8"?>
-<ct:contentTypeSchema xmlns:ct="http://schemas.microsoft.com/office/2006/metadata/contentType" xmlns:ma="http://schemas.microsoft.com/office/2006/metadata/properties/metaAttributes" ct:_="" ma:_="" ma:contentTypeName="Dokument" ma:contentTypeID="0x0101004DBCBF10187C2049BEFA2D1AFA305BD2" ma:contentTypeVersion="17" ma:contentTypeDescription="Ein neues Dokument erstellen." ma:contentTypeScope="" ma:versionID="faf410570ffecae7a72d97553970a30c">
-  <xsd:schema xmlns:xsd="http://www.w3.org/2001/XMLSchema" xmlns:xs="http://www.w3.org/2001/XMLSchema" xmlns:p="http://schemas.microsoft.com/office/2006/metadata/properties" xmlns:ns2="fcc6e4e0-d01e-4d5a-ab7d-060b3acc89bd" xmlns:ns3="2dc3346c-299b-487a-a3f4-1146a06367a3" targetNamespace="http://schemas.microsoft.com/office/2006/metadata/properties" ma:root="true" ma:fieldsID="660996077d79582a7b86161b26ec4854" ns2:_="" ns3:_="">
+<ct:contentTypeSchema xmlns:ct="http://schemas.microsoft.com/office/2006/metadata/contentType" xmlns:ma="http://schemas.microsoft.com/office/2006/metadata/properties/metaAttributes" ct:_="" ma:_="" ma:contentTypeName="Document" ma:contentTypeID="0x0101004DBCBF10187C2049BEFA2D1AFA305BD2" ma:contentTypeVersion="17" ma:contentTypeDescription="Create a new document." ma:contentTypeScope="" ma:versionID="51f8d2c78fb77033c91d57071bf15ef4">
+  <xsd:schema xmlns:xsd="http://www.w3.org/2001/XMLSchema" xmlns:xs="http://www.w3.org/2001/XMLSchema" xmlns:p="http://schemas.microsoft.com/office/2006/metadata/properties" xmlns:ns2="fcc6e4e0-d01e-4d5a-ab7d-060b3acc89bd" xmlns:ns3="2dc3346c-299b-487a-a3f4-1146a06367a3" targetNamespace="http://schemas.microsoft.com/office/2006/metadata/properties" ma:root="true" ma:fieldsID="e20d324cb635921152df525aab47358d" ns2:_="" ns3:_="">
     <xsd:import namespace="fcc6e4e0-d01e-4d5a-ab7d-060b3acc89bd"/>
     <xsd:import namespace="2dc3346c-299b-487a-a3f4-1146a06367a3"/>
     <xsd:element name="properties">
@@ -1794,7 +1794,7 @@
         <xsd:restriction base="dms:Unknown"/>
       </xsd:simpleType>
     </xsd:element>
-    <xsd:element name="lcf76f155ced4ddcb4097134ff3c332f" ma:index="20" nillable="true" ma:taxonomy="true" ma:internalName="lcf76f155ced4ddcb4097134ff3c332f" ma:taxonomyFieldName="MediaServiceImageTags" ma:displayName="Bildmarkierungen" ma:readOnly="false" ma:fieldId="{5cf76f15-5ced-4ddc-b409-7134ff3c332f}" ma:taxonomyMulti="true" ma:sspId="c10e8834-7643-460f-9b26-672df21ce4fa" ma:termSetId="09814cd3-568e-fe90-9814-8d621ff8fb84" ma:anchorId="fba54fb3-c3e1-fe81-a776-ca4b69148c4d" ma:open="true" ma:isKeyword="false">
+    <xsd:element name="lcf76f155ced4ddcb4097134ff3c332f" ma:index="20" nillable="true" ma:taxonomy="true" ma:internalName="lcf76f155ced4ddcb4097134ff3c332f" ma:taxonomyFieldName="MediaServiceImageTags" ma:displayName="Image Tags" ma:readOnly="false" ma:fieldId="{5cf76f15-5ced-4ddc-b409-7134ff3c332f}" ma:taxonomyMulti="true" ma:sspId="c10e8834-7643-460f-9b26-672df21ce4fa" ma:termSetId="09814cd3-568e-fe90-9814-8d621ff8fb84" ma:anchorId="fba54fb3-c3e1-fe81-a776-ca4b69148c4d" ma:open="true" ma:isKeyword="false">
       <xsd:complexType>
         <xsd:sequence>
           <xsd:element ref="pc:Terms" minOccurs="0" maxOccurs="1"/>
@@ -1836,7 +1836,7 @@
   <xsd:schema xmlns:xsd="http://www.w3.org/2001/XMLSchema" xmlns:xs="http://www.w3.org/2001/XMLSchema" xmlns:dms="http://schemas.microsoft.com/office/2006/documentManagement/types" xmlns:pc="http://schemas.microsoft.com/office/infopath/2007/PartnerControls" targetNamespace="2dc3346c-299b-487a-a3f4-1146a06367a3" elementFormDefault="qualified">
     <xsd:import namespace="http://schemas.microsoft.com/office/2006/documentManagement/types"/>
     <xsd:import namespace="http://schemas.microsoft.com/office/infopath/2007/PartnerControls"/>
-    <xsd:element name="SharedWithUsers" ma:index="17" nillable="true" ma:displayName="Freigegeben für" ma:internalName="SharedWithUsers" ma:readOnly="true">
+    <xsd:element name="SharedWithUsers" ma:index="17" nillable="true" ma:displayName="Shared With" ma:internalName="SharedWithUsers" ma:readOnly="true">
       <xsd:complexType>
         <xsd:complexContent>
           <xsd:extension base="dms:UserMulti">
@@ -1855,7 +1855,7 @@
         </xsd:complexContent>
       </xsd:complexType>
     </xsd:element>
-    <xsd:element name="SharedWithDetails" ma:index="18" nillable="true" ma:displayName="Freigegeben für - Details" ma:internalName="SharedWithDetails" ma:readOnly="true">
+    <xsd:element name="SharedWithDetails" ma:index="18" nillable="true" ma:displayName="Shared With Details" ma:internalName="SharedWithDetails" ma:readOnly="true">
       <xsd:simpleType>
         <xsd:restriction base="dms:Note">
           <xsd:maxLength value="255"/>
@@ -1883,8 +1883,8 @@
         <xsd:element ref="dc:creator" minOccurs="0" maxOccurs="1"/>
         <xsd:element ref="dcterms:created" minOccurs="0" maxOccurs="1"/>
         <xsd:element ref="dc:identifier" minOccurs="0" maxOccurs="1"/>
-        <xsd:element name="contentType" minOccurs="0" maxOccurs="1" type="xsd:string" ma:index="0" ma:displayName="Inhaltstyp"/>
-        <xsd:element ref="dc:title" minOccurs="0" maxOccurs="1" ma:index="4" ma:displayName="Titel"/>
+        <xsd:element name="contentType" minOccurs="0" maxOccurs="1" type="xsd:string" ma:index="0" ma:displayName="Content Type"/>
+        <xsd:element ref="dc:title" minOccurs="0" maxOccurs="1" ma:index="4" ma:displayName="Title"/>
         <xsd:element ref="dc:subject" minOccurs="0" maxOccurs="1"/>
         <xsd:element ref="dc:description" minOccurs="0" maxOccurs="1"/>
         <xsd:element name="keywords" minOccurs="0" maxOccurs="1" type="xsd:string"/>
@@ -2001,7 +2001,7 @@
 </file>
 
 <file path=customXml/itemProps1.xml><?xml version="1.0" encoding="utf-8"?>
-<ds:datastoreItem xmlns:ds="http://schemas.openxmlformats.org/officeDocument/2006/customXml" ds:itemID="{13B659DA-BCAB-4B86-8162-682772080DDD}"/>
+<ds:datastoreItem xmlns:ds="http://schemas.openxmlformats.org/officeDocument/2006/customXml" ds:itemID="{FD93F8FB-B7C4-4670-A08F-B2736DE2D00D}"/>
 </file>
 
 <file path=customXml/itemProps2.xml><?xml version="1.0" encoding="utf-8"?>

</xml_diff>